<commit_message>
Fix EEPROM not initializing on first boot
</commit_message>
<xml_diff>
--- a/RGB-IR LED Panel Command Set.docx
+++ b/RGB-IR LED Panel Command Set.docx
@@ -2357,7 +2357,15 @@
     </w:p>
     <w:p>
       <w:r>
-        <w:t>The color can be spelled out or a shortened version can be used (RED, GRN, BLU, IR) or, simply, just the first letter is needed (</w:t>
+        <w:t xml:space="preserve">The color can be spelled </w:t>
+      </w:r>
+      <w:proofErr w:type="gramStart"/>
+      <w:r>
+        <w:t>out</w:t>
+      </w:r>
+      <w:proofErr w:type="gramEnd"/>
+      <w:r>
+        <w:t xml:space="preserve"> or a shortened version can be used (RED, GRN, BLU, IR) or, simply, just the first letter is needed (</w:t>
       </w:r>
       <w:proofErr w:type="gramStart"/>
       <w:r>

</xml_diff>